<commit_message>
docs: refuerza sustentacion del proceso QA
</commit_message>
<xml_diff>
--- a/docs/entrega/PC3_PERIFERICOS_corregido_auditoria.docx
+++ b/docs/entrega/PC3_PERIFERICOS_corregido_auditoria.docx
@@ -31128,6 +31128,1991 @@
           <w:sz w:val="21"/>
         </w:rPr>
         <w:t>Conclusion de auditoria visual: no se requiere reemplazar imagenes para la entrega actual. La mejora aplicada fue documentar su funcion probatoria y anadir descripciones alternativas para accesibilidad basica.</w:t>
+      </w:r>
+    </w:p>
+    <w:p>
+      <w:r>
+        <w:br w:type="page"/>
+      </w:r>
+    </w:p>
+    <w:p>
+      <w:pPr>
+        <w:pStyle w:val="Ttulo1"/>
+      </w:pPr>
+      <w:r>
+        <w:rPr>
+          <w:rFonts w:ascii="Arial" w:hAnsi="Arial"/>
+          <w:color w:val="0B3045"/>
+        </w:rPr>
+        <w:t>Anexo E. Sustentacion orientada al proceso de calidad</w:t>
+      </w:r>
+    </w:p>
+    <w:p>
+      <w:pPr>
+        <w:spacing w:after="120"/>
+        <w:jc w:val="both"/>
+      </w:pPr>
+      <w:r>
+        <w:rPr>
+          <w:rFonts w:ascii="Arial" w:hAnsi="Arial"/>
+          <w:sz w:val="21"/>
+        </w:rPr>
+        <w:t>El profesor recalco que el criterio principal no es solamente que la plataforma funcione en una demostracion, sino que exista un proceso de calidad defendible. Por ello, la sustentacion debe demostrar que el equipo siguio un ciclo ordenado: planificar, implementar, verificar, validar, registrar evidencias, analizar riesgos y proponer mejoras.</w:t>
+      </w:r>
+    </w:p>
+    <w:p>
+      <w:pPr>
+        <w:pStyle w:val="Ttulo2"/>
+      </w:pPr>
+      <w:r>
+        <w:rPr>
+          <w:rFonts w:ascii="Arial" w:hAnsi="Arial"/>
+          <w:color w:val="0B3045"/>
+        </w:rPr>
+        <w:t>E.1 Idea central para defender el proyecto</w:t>
+      </w:r>
+    </w:p>
+    <w:p>
+      <w:pPr>
+        <w:spacing w:after="120"/>
+        <w:jc w:val="both"/>
+      </w:pPr>
+      <w:r>
+        <w:rPr>
+          <w:rFonts w:ascii="Arial" w:hAnsi="Arial"/>
+          <w:sz w:val="21"/>
+        </w:rPr>
+        <w:t>La frase guia de la exposicion es: No construimos una aplicacion al azar; seguimos un proceso de ingenieria de software y aseguramiento de calidad. La plataforma es la evidencia tecnica, pero el valor academico principal esta en los requisitos, la arquitectura, las pruebas, la trazabilidad, los controles y la mejora continua.</w:t>
+      </w:r>
+    </w:p>
+    <w:p>
+      <w:pPr>
+        <w:pStyle w:val="Ttulo2"/>
+      </w:pPr>
+      <w:r>
+        <w:rPr>
+          <w:rFonts w:ascii="Arial" w:hAnsi="Arial"/>
+          <w:color w:val="0B3045"/>
+        </w:rPr>
+        <w:t>E.2 Proceso aplicado por fases</w:t>
+      </w:r>
+    </w:p>
+    <w:tbl>
+      <w:tblPr>
+        <w:tblStyle w:val="Tablaconcuadrcula"/>
+        <w:tblW w:type="auto" w:w="0"/>
+        <w:jc w:val="center"/>
+        <w:tblLayout w:type="autofit"/>
+        <w:tblLook w:firstColumn="1" w:firstRow="1" w:lastColumn="0" w:lastRow="0" w:noHBand="0" w:noVBand="1" w:val="04A0"/>
+      </w:tblPr>
+      <w:tblGrid>
+        <w:gridCol w:w="2448"/>
+        <w:gridCol w:w="2448"/>
+        <w:gridCol w:w="2448"/>
+        <w:gridCol w:w="2448"/>
+      </w:tblGrid>
+      <w:tr>
+        <w:tc>
+          <w:tcPr>
+            <w:tcW w:type="dxa" w:w="2448"/>
+            <w:vAlign w:val="center"/>
+            <w:shd w:fill="0B3045"/>
+          </w:tcPr>
+          <w:p>
+            <w:pPr>
+              <w:spacing w:after="0"/>
+            </w:pPr>
+            <w:r>
+              <w:rPr>
+                <w:rFonts w:ascii="Arial" w:hAnsi="Arial"/>
+                <w:b/>
+                <w:color w:val="FFFFFF"/>
+                <w:sz w:val="18"/>
+              </w:rPr>
+            </w:r>
+            <w:r>
+              <w:rPr>
+                <w:rFonts w:ascii="Arial" w:hAnsi="Arial"/>
+                <w:b/>
+                <w:color w:val="FFFFFF"/>
+                <w:sz w:val="18"/>
+              </w:rPr>
+              <w:t>Fase del proceso</w:t>
+            </w:r>
+          </w:p>
+        </w:tc>
+        <w:tc>
+          <w:tcPr>
+            <w:tcW w:type="dxa" w:w="2448"/>
+            <w:vAlign w:val="center"/>
+            <w:shd w:fill="0B3045"/>
+          </w:tcPr>
+          <w:p>
+            <w:pPr>
+              <w:spacing w:after="0"/>
+            </w:pPr>
+            <w:r>
+              <w:rPr>
+                <w:rFonts w:ascii="Arial" w:hAnsi="Arial"/>
+                <w:b/>
+                <w:color w:val="FFFFFF"/>
+                <w:sz w:val="18"/>
+              </w:rPr>
+            </w:r>
+            <w:r>
+              <w:rPr>
+                <w:rFonts w:ascii="Arial" w:hAnsi="Arial"/>
+                <w:b/>
+                <w:color w:val="FFFFFF"/>
+                <w:sz w:val="18"/>
+              </w:rPr>
+              <w:t>Que se hizo</w:t>
+            </w:r>
+          </w:p>
+        </w:tc>
+        <w:tc>
+          <w:tcPr>
+            <w:tcW w:type="dxa" w:w="2448"/>
+            <w:vAlign w:val="center"/>
+            <w:shd w:fill="0B3045"/>
+          </w:tcPr>
+          <w:p>
+            <w:pPr>
+              <w:spacing w:after="0"/>
+            </w:pPr>
+            <w:r>
+              <w:rPr>
+                <w:rFonts w:ascii="Arial" w:hAnsi="Arial"/>
+                <w:b/>
+                <w:color w:val="FFFFFF"/>
+                <w:sz w:val="18"/>
+              </w:rPr>
+            </w:r>
+            <w:r>
+              <w:rPr>
+                <w:rFonts w:ascii="Arial" w:hAnsi="Arial"/>
+                <w:b/>
+                <w:color w:val="FFFFFF"/>
+                <w:sz w:val="18"/>
+              </w:rPr>
+              <w:t>Evidencia que se muestra</w:t>
+            </w:r>
+          </w:p>
+        </w:tc>
+        <w:tc>
+          <w:tcPr>
+            <w:tcW w:type="dxa" w:w="2448"/>
+            <w:vAlign w:val="center"/>
+            <w:shd w:fill="0B3045"/>
+          </w:tcPr>
+          <w:p>
+            <w:pPr>
+              <w:spacing w:after="0"/>
+            </w:pPr>
+            <w:r>
+              <w:rPr>
+                <w:rFonts w:ascii="Arial" w:hAnsi="Arial"/>
+                <w:b/>
+                <w:color w:val="FFFFFF"/>
+                <w:sz w:val="18"/>
+              </w:rPr>
+            </w:r>
+            <w:r>
+              <w:rPr>
+                <w:rFonts w:ascii="Arial" w:hAnsi="Arial"/>
+                <w:b/>
+                <w:color w:val="FFFFFF"/>
+                <w:sz w:val="18"/>
+              </w:rPr>
+              <w:t>Relacion con calidad</w:t>
+            </w:r>
+          </w:p>
+        </w:tc>
+      </w:tr>
+      <w:tr>
+        <w:tc>
+          <w:tcPr>
+            <w:tcW w:type="dxa" w:w="2448"/>
+            <w:vAlign w:val="center"/>
+          </w:tcPr>
+          <w:p>
+            <w:pPr>
+              <w:spacing w:after="0"/>
+            </w:pPr>
+            <w:r>
+              <w:rPr>
+                <w:rFonts w:ascii="Arial" w:hAnsi="Arial"/>
+                <w:sz w:val="18"/>
+              </w:rPr>
+            </w:r>
+            <w:r>
+              <w:rPr>
+                <w:rFonts w:ascii="Arial" w:hAnsi="Arial"/>
+                <w:b w:val="0"/>
+                <w:sz w:val="18"/>
+              </w:rPr>
+              <w:t>Requisitos</w:t>
+            </w:r>
+          </w:p>
+        </w:tc>
+        <w:tc>
+          <w:tcPr>
+            <w:tcW w:type="dxa" w:w="2448"/>
+            <w:vAlign w:val="center"/>
+          </w:tcPr>
+          <w:p>
+            <w:pPr>
+              <w:spacing w:after="0"/>
+            </w:pPr>
+            <w:r>
+              <w:rPr>
+                <w:rFonts w:ascii="Arial" w:hAnsi="Arial"/>
+                <w:sz w:val="18"/>
+              </w:rPr>
+            </w:r>
+            <w:r>
+              <w:rPr>
+                <w:rFonts w:ascii="Arial" w:hAnsi="Arial"/>
+                <w:b w:val="0"/>
+                <w:sz w:val="18"/>
+              </w:rPr>
+              <w:t>Se definieron funcionalidades, roles, restricciones y criterios de aceptacion.</w:t>
+            </w:r>
+          </w:p>
+        </w:tc>
+        <w:tc>
+          <w:tcPr>
+            <w:tcW w:type="dxa" w:w="2448"/>
+            <w:vAlign w:val="center"/>
+          </w:tcPr>
+          <w:p>
+            <w:pPr>
+              <w:spacing w:after="0"/>
+            </w:pPr>
+            <w:r>
+              <w:rPr>
+                <w:rFonts w:ascii="Arial" w:hAnsi="Arial"/>
+                <w:sz w:val="18"/>
+              </w:rPr>
+            </w:r>
+            <w:r>
+              <w:rPr>
+                <w:rFonts w:ascii="Arial" w:hAnsi="Arial"/>
+                <w:b w:val="0"/>
+                <w:sz w:val="18"/>
+              </w:rPr>
+              <w:t>requirements.md, user stories, matriz RF.</w:t>
+            </w:r>
+          </w:p>
+        </w:tc>
+        <w:tc>
+          <w:tcPr>
+            <w:tcW w:type="dxa" w:w="2448"/>
+            <w:vAlign w:val="center"/>
+          </w:tcPr>
+          <w:p>
+            <w:pPr>
+              <w:spacing w:after="0"/>
+            </w:pPr>
+            <w:r>
+              <w:rPr>
+                <w:rFonts w:ascii="Arial" w:hAnsi="Arial"/>
+                <w:sz w:val="18"/>
+              </w:rPr>
+            </w:r>
+            <w:r>
+              <w:rPr>
+                <w:rFonts w:ascii="Arial" w:hAnsi="Arial"/>
+                <w:b w:val="0"/>
+                <w:sz w:val="18"/>
+              </w:rPr>
+              <w:t>Gestion de requisitos y trazabilidad CMMI.</w:t>
+            </w:r>
+          </w:p>
+        </w:tc>
+      </w:tr>
+      <w:tr>
+        <w:tc>
+          <w:tcPr>
+            <w:tcW w:type="dxa" w:w="2448"/>
+            <w:vAlign w:val="center"/>
+          </w:tcPr>
+          <w:p>
+            <w:pPr>
+              <w:spacing w:after="0"/>
+            </w:pPr>
+            <w:r>
+              <w:rPr>
+                <w:rFonts w:ascii="Arial" w:hAnsi="Arial"/>
+                <w:sz w:val="18"/>
+              </w:rPr>
+            </w:r>
+            <w:r>
+              <w:rPr>
+                <w:rFonts w:ascii="Arial" w:hAnsi="Arial"/>
+                <w:b w:val="0"/>
+                <w:sz w:val="18"/>
+              </w:rPr>
+              <w:t>Arquitectura</w:t>
+            </w:r>
+          </w:p>
+        </w:tc>
+        <w:tc>
+          <w:tcPr>
+            <w:tcW w:type="dxa" w:w="2448"/>
+            <w:vAlign w:val="center"/>
+          </w:tcPr>
+          <w:p>
+            <w:pPr>
+              <w:spacing w:after="0"/>
+            </w:pPr>
+            <w:r>
+              <w:rPr>
+                <w:rFonts w:ascii="Arial" w:hAnsi="Arial"/>
+                <w:sz w:val="18"/>
+              </w:rPr>
+            </w:r>
+            <w:r>
+              <w:rPr>
+                <w:rFonts w:ascii="Arial" w:hAnsi="Arial"/>
+                <w:b w:val="0"/>
+                <w:sz w:val="18"/>
+              </w:rPr>
+              <w:t>Se separaron servicios: frontend, backend, PBX, base de datos, IAM, proxy y QA.</w:t>
+            </w:r>
+          </w:p>
+        </w:tc>
+        <w:tc>
+          <w:tcPr>
+            <w:tcW w:type="dxa" w:w="2448"/>
+            <w:vAlign w:val="center"/>
+          </w:tcPr>
+          <w:p>
+            <w:pPr>
+              <w:spacing w:after="0"/>
+            </w:pPr>
+            <w:r>
+              <w:rPr>
+                <w:rFonts w:ascii="Arial" w:hAnsi="Arial"/>
+                <w:sz w:val="18"/>
+              </w:rPr>
+            </w:r>
+            <w:r>
+              <w:rPr>
+                <w:rFonts w:ascii="Arial" w:hAnsi="Arial"/>
+                <w:b w:val="0"/>
+                <w:sz w:val="18"/>
+              </w:rPr>
+              <w:t>architecture.md, diagramas y Docker Compose.</w:t>
+            </w:r>
+          </w:p>
+        </w:tc>
+        <w:tc>
+          <w:tcPr>
+            <w:tcW w:type="dxa" w:w="2448"/>
+            <w:vAlign w:val="center"/>
+          </w:tcPr>
+          <w:p>
+            <w:pPr>
+              <w:spacing w:after="0"/>
+            </w:pPr>
+            <w:r>
+              <w:rPr>
+                <w:rFonts w:ascii="Arial" w:hAnsi="Arial"/>
+                <w:sz w:val="18"/>
+              </w:rPr>
+            </w:r>
+            <w:r>
+              <w:rPr>
+                <w:rFonts w:ascii="Arial" w:hAnsi="Arial"/>
+                <w:b w:val="0"/>
+                <w:sz w:val="18"/>
+              </w:rPr>
+              <w:t>Mantenibilidad, portabilidad y seguridad ISO 25010.</w:t>
+            </w:r>
+          </w:p>
+        </w:tc>
+      </w:tr>
+      <w:tr>
+        <w:tc>
+          <w:tcPr>
+            <w:tcW w:type="dxa" w:w="2448"/>
+            <w:vAlign w:val="center"/>
+          </w:tcPr>
+          <w:p>
+            <w:pPr>
+              <w:spacing w:after="0"/>
+            </w:pPr>
+            <w:r>
+              <w:rPr>
+                <w:rFonts w:ascii="Arial" w:hAnsi="Arial"/>
+                <w:sz w:val="18"/>
+              </w:rPr>
+            </w:r>
+            <w:r>
+              <w:rPr>
+                <w:rFonts w:ascii="Arial" w:hAnsi="Arial"/>
+                <w:b w:val="0"/>
+                <w:sz w:val="18"/>
+              </w:rPr>
+              <w:t>Implementacion incremental</w:t>
+            </w:r>
+          </w:p>
+        </w:tc>
+        <w:tc>
+          <w:tcPr>
+            <w:tcW w:type="dxa" w:w="2448"/>
+            <w:vAlign w:val="center"/>
+          </w:tcPr>
+          <w:p>
+            <w:pPr>
+              <w:spacing w:after="0"/>
+            </w:pPr>
+            <w:r>
+              <w:rPr>
+                <w:rFonts w:ascii="Arial" w:hAnsi="Arial"/>
+                <w:sz w:val="18"/>
+              </w:rPr>
+            </w:r>
+            <w:r>
+              <w:rPr>
+                <w:rFonts w:ascii="Arial" w:hAnsi="Arial"/>
+                <w:b w:val="0"/>
+                <w:sz w:val="18"/>
+              </w:rPr>
+              <w:t>Se trabajo por fases: Docker, Asterisk, CDR, WebRTC, midPoint, seguridad y QA.</w:t>
+            </w:r>
+          </w:p>
+        </w:tc>
+        <w:tc>
+          <w:tcPr>
+            <w:tcW w:type="dxa" w:w="2448"/>
+            <w:vAlign w:val="center"/>
+          </w:tcPr>
+          <w:p>
+            <w:pPr>
+              <w:spacing w:after="0"/>
+            </w:pPr>
+            <w:r>
+              <w:rPr>
+                <w:rFonts w:ascii="Arial" w:hAnsi="Arial"/>
+                <w:sz w:val="18"/>
+              </w:rPr>
+            </w:r>
+            <w:r>
+              <w:rPr>
+                <w:rFonts w:ascii="Arial" w:hAnsi="Arial"/>
+                <w:b w:val="0"/>
+                <w:sz w:val="18"/>
+              </w:rPr>
+              <w:t>Commits, estructura del repo y roadmap.</w:t>
+            </w:r>
+          </w:p>
+        </w:tc>
+        <w:tc>
+          <w:tcPr>
+            <w:tcW w:type="dxa" w:w="2448"/>
+            <w:vAlign w:val="center"/>
+          </w:tcPr>
+          <w:p>
+            <w:pPr>
+              <w:spacing w:after="0"/>
+            </w:pPr>
+            <w:r>
+              <w:rPr>
+                <w:rFonts w:ascii="Arial" w:hAnsi="Arial"/>
+                <w:sz w:val="18"/>
+              </w:rPr>
+            </w:r>
+            <w:r>
+              <w:rPr>
+                <w:rFonts w:ascii="Arial" w:hAnsi="Arial"/>
+                <w:b w:val="0"/>
+                <w:sz w:val="18"/>
+              </w:rPr>
+              <w:t>Gestion de configuracion y control de cambios.</w:t>
+            </w:r>
+          </w:p>
+        </w:tc>
+      </w:tr>
+      <w:tr>
+        <w:tc>
+          <w:tcPr>
+            <w:tcW w:type="dxa" w:w="2448"/>
+            <w:vAlign w:val="center"/>
+          </w:tcPr>
+          <w:p>
+            <w:pPr>
+              <w:spacing w:after="0"/>
+            </w:pPr>
+            <w:r>
+              <w:rPr>
+                <w:rFonts w:ascii="Arial" w:hAnsi="Arial"/>
+                <w:sz w:val="18"/>
+              </w:rPr>
+            </w:r>
+            <w:r>
+              <w:rPr>
+                <w:rFonts w:ascii="Arial" w:hAnsi="Arial"/>
+                <w:b w:val="0"/>
+                <w:sz w:val="18"/>
+              </w:rPr>
+              <w:t>Verificacion</w:t>
+            </w:r>
+          </w:p>
+        </w:tc>
+        <w:tc>
+          <w:tcPr>
+            <w:tcW w:type="dxa" w:w="2448"/>
+            <w:vAlign w:val="center"/>
+          </w:tcPr>
+          <w:p>
+            <w:pPr>
+              <w:spacing w:after="0"/>
+            </w:pPr>
+            <w:r>
+              <w:rPr>
+                <w:rFonts w:ascii="Arial" w:hAnsi="Arial"/>
+                <w:sz w:val="18"/>
+              </w:rPr>
+            </w:r>
+            <w:r>
+              <w:rPr>
+                <w:rFonts w:ascii="Arial" w:hAnsi="Arial"/>
+                <w:b w:val="0"/>
+                <w:sz w:val="18"/>
+              </w:rPr>
+              <w:t>Se ejecutaron pruebas unitarias, integracion, humo, e2e, carga y seguridad.</w:t>
+            </w:r>
+          </w:p>
+        </w:tc>
+        <w:tc>
+          <w:tcPr>
+            <w:tcW w:type="dxa" w:w="2448"/>
+            <w:vAlign w:val="center"/>
+          </w:tcPr>
+          <w:p>
+            <w:pPr>
+              <w:spacing w:after="0"/>
+            </w:pPr>
+            <w:r>
+              <w:rPr>
+                <w:rFonts w:ascii="Arial" w:hAnsi="Arial"/>
+                <w:sz w:val="18"/>
+              </w:rPr>
+            </w:r>
+            <w:r>
+              <w:rPr>
+                <w:rFonts w:ascii="Arial" w:hAnsi="Arial"/>
+                <w:b w:val="0"/>
+                <w:sz w:val="18"/>
+              </w:rPr>
+              <w:t>pytest, vitest, Playwright, k6, Trivy y SonarQube.</w:t>
+            </w:r>
+          </w:p>
+        </w:tc>
+        <w:tc>
+          <w:tcPr>
+            <w:tcW w:type="dxa" w:w="2448"/>
+            <w:vAlign w:val="center"/>
+          </w:tcPr>
+          <w:p>
+            <w:pPr>
+              <w:spacing w:after="0"/>
+            </w:pPr>
+            <w:r>
+              <w:rPr>
+                <w:rFonts w:ascii="Arial" w:hAnsi="Arial"/>
+                <w:sz w:val="18"/>
+              </w:rPr>
+            </w:r>
+            <w:r>
+              <w:rPr>
+                <w:rFonts w:ascii="Arial" w:hAnsi="Arial"/>
+                <w:b w:val="0"/>
+                <w:sz w:val="18"/>
+              </w:rPr>
+              <w:t>Verificacion CMMI e ISO/IEC 9126.</w:t>
+            </w:r>
+          </w:p>
+        </w:tc>
+      </w:tr>
+      <w:tr>
+        <w:tc>
+          <w:tcPr>
+            <w:tcW w:type="dxa" w:w="2448"/>
+            <w:vAlign w:val="center"/>
+          </w:tcPr>
+          <w:p>
+            <w:pPr>
+              <w:spacing w:after="0"/>
+            </w:pPr>
+            <w:r>
+              <w:rPr>
+                <w:rFonts w:ascii="Arial" w:hAnsi="Arial"/>
+                <w:sz w:val="18"/>
+              </w:rPr>
+            </w:r>
+            <w:r>
+              <w:rPr>
+                <w:rFonts w:ascii="Arial" w:hAnsi="Arial"/>
+                <w:b w:val="0"/>
+                <w:sz w:val="18"/>
+              </w:rPr>
+              <w:t>Validacion</w:t>
+            </w:r>
+          </w:p>
+        </w:tc>
+        <w:tc>
+          <w:tcPr>
+            <w:tcW w:type="dxa" w:w="2448"/>
+            <w:vAlign w:val="center"/>
+          </w:tcPr>
+          <w:p>
+            <w:pPr>
+              <w:spacing w:after="0"/>
+            </w:pPr>
+            <w:r>
+              <w:rPr>
+                <w:rFonts w:ascii="Arial" w:hAnsi="Arial"/>
+                <w:sz w:val="18"/>
+              </w:rPr>
+            </w:r>
+            <w:r>
+              <w:rPr>
+                <w:rFonts w:ascii="Arial" w:hAnsi="Arial"/>
+                <w:b w:val="0"/>
+                <w:sz w:val="18"/>
+              </w:rPr>
+              <w:t>Se probaron flujos reales: login, llamadas, CDR, auditoria, reportes y roles.</w:t>
+            </w:r>
+          </w:p>
+        </w:tc>
+        <w:tc>
+          <w:tcPr>
+            <w:tcW w:type="dxa" w:w="2448"/>
+            <w:vAlign w:val="center"/>
+          </w:tcPr>
+          <w:p>
+            <w:pPr>
+              <w:spacing w:after="0"/>
+            </w:pPr>
+            <w:r>
+              <w:rPr>
+                <w:rFonts w:ascii="Arial" w:hAnsi="Arial"/>
+                <w:sz w:val="18"/>
+              </w:rPr>
+            </w:r>
+            <w:r>
+              <w:rPr>
+                <w:rFonts w:ascii="Arial" w:hAnsi="Arial"/>
+                <w:b w:val="0"/>
+                <w:sz w:val="18"/>
+              </w:rPr>
+              <w:t>Capturas, video demo, Swagger y CDR en BD.</w:t>
+            </w:r>
+          </w:p>
+        </w:tc>
+        <w:tc>
+          <w:tcPr>
+            <w:tcW w:type="dxa" w:w="2448"/>
+            <w:vAlign w:val="center"/>
+          </w:tcPr>
+          <w:p>
+            <w:pPr>
+              <w:spacing w:after="0"/>
+            </w:pPr>
+            <w:r>
+              <w:rPr>
+                <w:rFonts w:ascii="Arial" w:hAnsi="Arial"/>
+                <w:sz w:val="18"/>
+              </w:rPr>
+            </w:r>
+            <w:r>
+              <w:rPr>
+                <w:rFonts w:ascii="Arial" w:hAnsi="Arial"/>
+                <w:b w:val="0"/>
+                <w:sz w:val="18"/>
+              </w:rPr>
+              <w:t>Validacion con usuario y adecuacion funcional.</w:t>
+            </w:r>
+          </w:p>
+        </w:tc>
+      </w:tr>
+      <w:tr>
+        <w:tc>
+          <w:tcPr>
+            <w:tcW w:type="dxa" w:w="2448"/>
+            <w:vAlign w:val="center"/>
+          </w:tcPr>
+          <w:p>
+            <w:pPr>
+              <w:spacing w:after="0"/>
+            </w:pPr>
+            <w:r>
+              <w:rPr>
+                <w:rFonts w:ascii="Arial" w:hAnsi="Arial"/>
+                <w:sz w:val="18"/>
+              </w:rPr>
+            </w:r>
+            <w:r>
+              <w:rPr>
+                <w:rFonts w:ascii="Arial" w:hAnsi="Arial"/>
+                <w:b w:val="0"/>
+                <w:sz w:val="18"/>
+              </w:rPr>
+              <w:t>Gestion de riesgos</w:t>
+            </w:r>
+          </w:p>
+        </w:tc>
+        <w:tc>
+          <w:tcPr>
+            <w:tcW w:type="dxa" w:w="2448"/>
+            <w:vAlign w:val="center"/>
+          </w:tcPr>
+          <w:p>
+            <w:pPr>
+              <w:spacing w:after="0"/>
+            </w:pPr>
+            <w:r>
+              <w:rPr>
+                <w:rFonts w:ascii="Arial" w:hAnsi="Arial"/>
+                <w:sz w:val="18"/>
+              </w:rPr>
+            </w:r>
+            <w:r>
+              <w:rPr>
+                <w:rFonts w:ascii="Arial" w:hAnsi="Arial"/>
+                <w:b w:val="0"/>
+                <w:sz w:val="18"/>
+              </w:rPr>
+              <w:t>Se declararon limites: certificados, red, NAT, video, alta disponibilidad y produccion.</w:t>
+            </w:r>
+          </w:p>
+        </w:tc>
+        <w:tc>
+          <w:tcPr>
+            <w:tcW w:type="dxa" w:w="2448"/>
+            <w:vAlign w:val="center"/>
+          </w:tcPr>
+          <w:p>
+            <w:pPr>
+              <w:spacing w:after="0"/>
+            </w:pPr>
+            <w:r>
+              <w:rPr>
+                <w:rFonts w:ascii="Arial" w:hAnsi="Arial"/>
+                <w:sz w:val="18"/>
+              </w:rPr>
+            </w:r>
+            <w:r>
+              <w:rPr>
+                <w:rFonts w:ascii="Arial" w:hAnsi="Arial"/>
+                <w:b w:val="0"/>
+                <w:sz w:val="18"/>
+              </w:rPr>
+              <w:t>risk_matrix.md y seccion de brechas.</w:t>
+            </w:r>
+          </w:p>
+        </w:tc>
+        <w:tc>
+          <w:tcPr>
+            <w:tcW w:type="dxa" w:w="2448"/>
+            <w:vAlign w:val="center"/>
+          </w:tcPr>
+          <w:p>
+            <w:pPr>
+              <w:spacing w:after="0"/>
+            </w:pPr>
+            <w:r>
+              <w:rPr>
+                <w:rFonts w:ascii="Arial" w:hAnsi="Arial"/>
+                <w:sz w:val="18"/>
+              </w:rPr>
+            </w:r>
+            <w:r>
+              <w:rPr>
+                <w:rFonts w:ascii="Arial" w:hAnsi="Arial"/>
+                <w:b w:val="0"/>
+                <w:sz w:val="18"/>
+              </w:rPr>
+              <w:t>Prevencion, mejora continua e ISO 27001.</w:t>
+            </w:r>
+          </w:p>
+        </w:tc>
+      </w:tr>
+      <w:tr>
+        <w:tc>
+          <w:tcPr>
+            <w:tcW w:type="dxa" w:w="2448"/>
+            <w:vAlign w:val="center"/>
+          </w:tcPr>
+          <w:p>
+            <w:pPr>
+              <w:spacing w:after="0"/>
+            </w:pPr>
+            <w:r>
+              <w:rPr>
+                <w:rFonts w:ascii="Arial" w:hAnsi="Arial"/>
+                <w:sz w:val="18"/>
+              </w:rPr>
+            </w:r>
+            <w:r>
+              <w:rPr>
+                <w:rFonts w:ascii="Arial" w:hAnsi="Arial"/>
+                <w:b w:val="0"/>
+                <w:sz w:val="18"/>
+              </w:rPr>
+              <w:t>Mejora continua</w:t>
+            </w:r>
+          </w:p>
+        </w:tc>
+        <w:tc>
+          <w:tcPr>
+            <w:tcW w:type="dxa" w:w="2448"/>
+            <w:vAlign w:val="center"/>
+          </w:tcPr>
+          <w:p>
+            <w:pPr>
+              <w:spacing w:after="0"/>
+            </w:pPr>
+            <w:r>
+              <w:rPr>
+                <w:rFonts w:ascii="Arial" w:hAnsi="Arial"/>
+                <w:sz w:val="18"/>
+              </w:rPr>
+            </w:r>
+            <w:r>
+              <w:rPr>
+                <w:rFonts w:ascii="Arial" w:hAnsi="Arial"/>
+                <w:b w:val="0"/>
+                <w:sz w:val="18"/>
+              </w:rPr>
+              <w:t>Se corrigieron incidencias como puertos, Swagger, documentacion e imagenes.</w:t>
+            </w:r>
+          </w:p>
+        </w:tc>
+        <w:tc>
+          <w:tcPr>
+            <w:tcW w:type="dxa" w:w="2448"/>
+            <w:vAlign w:val="center"/>
+          </w:tcPr>
+          <w:p>
+            <w:pPr>
+              <w:spacing w:after="0"/>
+            </w:pPr>
+            <w:r>
+              <w:rPr>
+                <w:rFonts w:ascii="Arial" w:hAnsi="Arial"/>
+                <w:sz w:val="18"/>
+              </w:rPr>
+            </w:r>
+            <w:r>
+              <w:rPr>
+                <w:rFonts w:ascii="Arial" w:hAnsi="Arial"/>
+                <w:b w:val="0"/>
+                <w:sz w:val="18"/>
+              </w:rPr>
+              <w:t>Historial Git, QA report y version final del Word.</w:t>
+            </w:r>
+          </w:p>
+        </w:tc>
+        <w:tc>
+          <w:tcPr>
+            <w:tcW w:type="dxa" w:w="2448"/>
+            <w:vAlign w:val="center"/>
+          </w:tcPr>
+          <w:p>
+            <w:pPr>
+              <w:spacing w:after="0"/>
+            </w:pPr>
+            <w:r>
+              <w:rPr>
+                <w:rFonts w:ascii="Arial" w:hAnsi="Arial"/>
+                <w:sz w:val="18"/>
+              </w:rPr>
+            </w:r>
+            <w:r>
+              <w:rPr>
+                <w:rFonts w:ascii="Arial" w:hAnsi="Arial"/>
+                <w:b w:val="0"/>
+                <w:sz w:val="18"/>
+              </w:rPr>
+              <w:t>Ciclo PDCA: planificar, hacer, verificar, actuar.</w:t>
+            </w:r>
+          </w:p>
+        </w:tc>
+      </w:tr>
+    </w:tbl>
+    <w:p/>
+    <w:p>
+      <w:pPr>
+        <w:pStyle w:val="Ttulo2"/>
+      </w:pPr>
+      <w:r>
+        <w:rPr>
+          <w:rFonts w:ascii="Arial" w:hAnsi="Arial"/>
+          <w:color w:val="0B3045"/>
+        </w:rPr>
+        <w:t>E.3 Como responder si algo falla en la demo</w:t>
+      </w:r>
+    </w:p>
+    <w:p>
+      <w:pPr>
+        <w:spacing w:after="120"/>
+        <w:jc w:val="both"/>
+      </w:pPr>
+      <w:r>
+        <w:rPr>
+          <w:rFonts w:ascii="Arial" w:hAnsi="Arial"/>
+          <w:sz w:val="21"/>
+        </w:rPr>
+        <w:t>Si durante la exposicion falla un servicio, una llamada o una pagina, no debe interpretarse como fracaso del proyecto. En calidad de software, una falla controlada se convierte en evidencia de proceso si el equipo sabe diagnosticarla, registrarla y proponer una accion correctiva.</w:t>
+      </w:r>
+    </w:p>
+    <w:tbl>
+      <w:tblPr>
+        <w:tblStyle w:val="Tablaconcuadrcula"/>
+        <w:tblW w:type="auto" w:w="0"/>
+        <w:jc w:val="center"/>
+        <w:tblLayout w:type="autofit"/>
+        <w:tblLook w:firstColumn="1" w:firstRow="1" w:lastColumn="0" w:lastRow="0" w:noHBand="0" w:noVBand="1" w:val="04A0"/>
+      </w:tblPr>
+      <w:tblGrid>
+        <w:gridCol w:w="3264"/>
+        <w:gridCol w:w="3264"/>
+        <w:gridCol w:w="3264"/>
+      </w:tblGrid>
+      <w:tr>
+        <w:tc>
+          <w:tcPr>
+            <w:tcW w:type="dxa" w:w="3264"/>
+            <w:vAlign w:val="center"/>
+            <w:shd w:fill="0B3045"/>
+          </w:tcPr>
+          <w:p>
+            <w:pPr>
+              <w:spacing w:after="0"/>
+            </w:pPr>
+            <w:r>
+              <w:rPr>
+                <w:rFonts w:ascii="Arial" w:hAnsi="Arial"/>
+                <w:b/>
+                <w:color w:val="FFFFFF"/>
+                <w:sz w:val="18"/>
+              </w:rPr>
+            </w:r>
+            <w:r>
+              <w:rPr>
+                <w:rFonts w:ascii="Arial" w:hAnsi="Arial"/>
+                <w:b/>
+                <w:color w:val="FFFFFF"/>
+                <w:sz w:val="18"/>
+              </w:rPr>
+              <w:t>Situacion</w:t>
+            </w:r>
+          </w:p>
+        </w:tc>
+        <w:tc>
+          <w:tcPr>
+            <w:tcW w:type="dxa" w:w="3264"/>
+            <w:vAlign w:val="center"/>
+            <w:shd w:fill="0B3045"/>
+          </w:tcPr>
+          <w:p>
+            <w:pPr>
+              <w:spacing w:after="0"/>
+            </w:pPr>
+            <w:r>
+              <w:rPr>
+                <w:rFonts w:ascii="Arial" w:hAnsi="Arial"/>
+                <w:b/>
+                <w:color w:val="FFFFFF"/>
+                <w:sz w:val="18"/>
+              </w:rPr>
+            </w:r>
+            <w:r>
+              <w:rPr>
+                <w:rFonts w:ascii="Arial" w:hAnsi="Arial"/>
+                <w:b/>
+                <w:color w:val="FFFFFF"/>
+                <w:sz w:val="18"/>
+              </w:rPr>
+              <w:t>Respuesta correcta ante el profesor</w:t>
+            </w:r>
+          </w:p>
+        </w:tc>
+        <w:tc>
+          <w:tcPr>
+            <w:tcW w:type="dxa" w:w="3264"/>
+            <w:vAlign w:val="center"/>
+            <w:shd w:fill="0B3045"/>
+          </w:tcPr>
+          <w:p>
+            <w:pPr>
+              <w:spacing w:after="0"/>
+            </w:pPr>
+            <w:r>
+              <w:rPr>
+                <w:rFonts w:ascii="Arial" w:hAnsi="Arial"/>
+                <w:b/>
+                <w:color w:val="FFFFFF"/>
+                <w:sz w:val="18"/>
+              </w:rPr>
+            </w:r>
+            <w:r>
+              <w:rPr>
+                <w:rFonts w:ascii="Arial" w:hAnsi="Arial"/>
+                <w:b/>
+                <w:color w:val="FFFFFF"/>
+                <w:sz w:val="18"/>
+              </w:rPr>
+              <w:t>Evidencia o accion</w:t>
+            </w:r>
+          </w:p>
+        </w:tc>
+      </w:tr>
+      <w:tr>
+        <w:tc>
+          <w:tcPr>
+            <w:tcW w:type="dxa" w:w="3264"/>
+            <w:vAlign w:val="center"/>
+          </w:tcPr>
+          <w:p>
+            <w:pPr>
+              <w:spacing w:after="0"/>
+            </w:pPr>
+            <w:r>
+              <w:rPr>
+                <w:rFonts w:ascii="Arial" w:hAnsi="Arial"/>
+                <w:sz w:val="18"/>
+              </w:rPr>
+            </w:r>
+            <w:r>
+              <w:rPr>
+                <w:rFonts w:ascii="Arial" w:hAnsi="Arial"/>
+                <w:b w:val="0"/>
+                <w:sz w:val="18"/>
+              </w:rPr>
+              <w:t>Docker no levanta</w:t>
+            </w:r>
+          </w:p>
+        </w:tc>
+        <w:tc>
+          <w:tcPr>
+            <w:tcW w:type="dxa" w:w="3264"/>
+            <w:vAlign w:val="center"/>
+          </w:tcPr>
+          <w:p>
+            <w:pPr>
+              <w:spacing w:after="0"/>
+            </w:pPr>
+            <w:r>
+              <w:rPr>
+                <w:rFonts w:ascii="Arial" w:hAnsi="Arial"/>
+                <w:sz w:val="18"/>
+              </w:rPr>
+            </w:r>
+            <w:r>
+              <w:rPr>
+                <w:rFonts w:ascii="Arial" w:hAnsi="Arial"/>
+                <w:b w:val="0"/>
+                <w:sz w:val="18"/>
+              </w:rPr>
+              <w:t>Se revisan contenedores, logs, puertos y healthchecks.</w:t>
+            </w:r>
+          </w:p>
+        </w:tc>
+        <w:tc>
+          <w:tcPr>
+            <w:tcW w:type="dxa" w:w="3264"/>
+            <w:vAlign w:val="center"/>
+          </w:tcPr>
+          <w:p>
+            <w:pPr>
+              <w:spacing w:after="0"/>
+            </w:pPr>
+            <w:r>
+              <w:rPr>
+                <w:rFonts w:ascii="Arial" w:hAnsi="Arial"/>
+                <w:sz w:val="18"/>
+              </w:rPr>
+            </w:r>
+            <w:r>
+              <w:rPr>
+                <w:rFonts w:ascii="Arial" w:hAnsi="Arial"/>
+                <w:b w:val="0"/>
+                <w:sz w:val="18"/>
+              </w:rPr>
+              <w:t>docker compose ps y docker compose logs.</w:t>
+            </w:r>
+          </w:p>
+        </w:tc>
+      </w:tr>
+      <w:tr>
+        <w:tc>
+          <w:tcPr>
+            <w:tcW w:type="dxa" w:w="3264"/>
+            <w:vAlign w:val="center"/>
+          </w:tcPr>
+          <w:p>
+            <w:pPr>
+              <w:spacing w:after="0"/>
+            </w:pPr>
+            <w:r>
+              <w:rPr>
+                <w:rFonts w:ascii="Arial" w:hAnsi="Arial"/>
+                <w:sz w:val="18"/>
+              </w:rPr>
+            </w:r>
+            <w:r>
+              <w:rPr>
+                <w:rFonts w:ascii="Arial" w:hAnsi="Arial"/>
+                <w:b w:val="0"/>
+                <w:sz w:val="18"/>
+              </w:rPr>
+              <w:t>Swagger no abre</w:t>
+            </w:r>
+          </w:p>
+        </w:tc>
+        <w:tc>
+          <w:tcPr>
+            <w:tcW w:type="dxa" w:w="3264"/>
+            <w:vAlign w:val="center"/>
+          </w:tcPr>
+          <w:p>
+            <w:pPr>
+              <w:spacing w:after="0"/>
+            </w:pPr>
+            <w:r>
+              <w:rPr>
+                <w:rFonts w:ascii="Arial" w:hAnsi="Arial"/>
+                <w:sz w:val="18"/>
+              </w:rPr>
+            </w:r>
+            <w:r>
+              <w:rPr>
+                <w:rFonts w:ascii="Arial" w:hAnsi="Arial"/>
+                <w:b w:val="0"/>
+                <w:sz w:val="18"/>
+              </w:rPr>
+              <w:t>Se verifica Nginx, CSP, /docs y /openapi.json.</w:t>
+            </w:r>
+          </w:p>
+        </w:tc>
+        <w:tc>
+          <w:tcPr>
+            <w:tcW w:type="dxa" w:w="3264"/>
+            <w:vAlign w:val="center"/>
+          </w:tcPr>
+          <w:p>
+            <w:pPr>
+              <w:spacing w:after="0"/>
+            </w:pPr>
+            <w:r>
+              <w:rPr>
+                <w:rFonts w:ascii="Arial" w:hAnsi="Arial"/>
+                <w:sz w:val="18"/>
+              </w:rPr>
+            </w:r>
+            <w:r>
+              <w:rPr>
+                <w:rFonts w:ascii="Arial" w:hAnsi="Arial"/>
+                <w:b w:val="0"/>
+                <w:sz w:val="18"/>
+              </w:rPr>
+              <w:t>Header CSP corregido y prueba 200 OK.</w:t>
+            </w:r>
+          </w:p>
+        </w:tc>
+      </w:tr>
+      <w:tr>
+        <w:tc>
+          <w:tcPr>
+            <w:tcW w:type="dxa" w:w="3264"/>
+            <w:vAlign w:val="center"/>
+          </w:tcPr>
+          <w:p>
+            <w:pPr>
+              <w:spacing w:after="0"/>
+            </w:pPr>
+            <w:r>
+              <w:rPr>
+                <w:rFonts w:ascii="Arial" w:hAnsi="Arial"/>
+                <w:sz w:val="18"/>
+              </w:rPr>
+            </w:r>
+            <w:r>
+              <w:rPr>
+                <w:rFonts w:ascii="Arial" w:hAnsi="Arial"/>
+                <w:b w:val="0"/>
+                <w:sz w:val="18"/>
+              </w:rPr>
+              <w:t>Llamada no conecta</w:t>
+            </w:r>
+          </w:p>
+        </w:tc>
+        <w:tc>
+          <w:tcPr>
+            <w:tcW w:type="dxa" w:w="3264"/>
+            <w:vAlign w:val="center"/>
+          </w:tcPr>
+          <w:p>
+            <w:pPr>
+              <w:spacing w:after="0"/>
+            </w:pPr>
+            <w:r>
+              <w:rPr>
+                <w:rFonts w:ascii="Arial" w:hAnsi="Arial"/>
+                <w:sz w:val="18"/>
+              </w:rPr>
+            </w:r>
+            <w:r>
+              <w:rPr>
+                <w:rFonts w:ascii="Arial" w:hAnsi="Arial"/>
+                <w:b w:val="0"/>
+                <w:sz w:val="18"/>
+              </w:rPr>
+              <w:t>Se revisa registro SIP, red Wi-Fi, NAT, codecs y puertos RTP.</w:t>
+            </w:r>
+          </w:p>
+        </w:tc>
+        <w:tc>
+          <w:tcPr>
+            <w:tcW w:type="dxa" w:w="3264"/>
+            <w:vAlign w:val="center"/>
+          </w:tcPr>
+          <w:p>
+            <w:pPr>
+              <w:spacing w:after="0"/>
+            </w:pPr>
+            <w:r>
+              <w:rPr>
+                <w:rFonts w:ascii="Arial" w:hAnsi="Arial"/>
+                <w:sz w:val="18"/>
+              </w:rPr>
+            </w:r>
+            <w:r>
+              <w:rPr>
+                <w:rFonts w:ascii="Arial" w:hAnsi="Arial"/>
+                <w:b w:val="0"/>
+                <w:sz w:val="18"/>
+              </w:rPr>
+              <w:t>pjsip show contacts, CDR y logs Asterisk.</w:t>
+            </w:r>
+          </w:p>
+        </w:tc>
+      </w:tr>
+      <w:tr>
+        <w:tc>
+          <w:tcPr>
+            <w:tcW w:type="dxa" w:w="3264"/>
+            <w:vAlign w:val="center"/>
+          </w:tcPr>
+          <w:p>
+            <w:pPr>
+              <w:spacing w:after="0"/>
+            </w:pPr>
+            <w:r>
+              <w:rPr>
+                <w:rFonts w:ascii="Arial" w:hAnsi="Arial"/>
+                <w:sz w:val="18"/>
+              </w:rPr>
+            </w:r>
+            <w:r>
+              <w:rPr>
+                <w:rFonts w:ascii="Arial" w:hAnsi="Arial"/>
+                <w:b w:val="0"/>
+                <w:sz w:val="18"/>
+              </w:rPr>
+              <w:t>No hay video</w:t>
+            </w:r>
+          </w:p>
+        </w:tc>
+        <w:tc>
+          <w:tcPr>
+            <w:tcW w:type="dxa" w:w="3264"/>
+            <w:vAlign w:val="center"/>
+          </w:tcPr>
+          <w:p>
+            <w:pPr>
+              <w:spacing w:after="0"/>
+            </w:pPr>
+            <w:r>
+              <w:rPr>
+                <w:rFonts w:ascii="Arial" w:hAnsi="Arial"/>
+                <w:sz w:val="18"/>
+              </w:rPr>
+            </w:r>
+            <w:r>
+              <w:rPr>
+                <w:rFonts w:ascii="Arial" w:hAnsi="Arial"/>
+                <w:b w:val="0"/>
+                <w:sz w:val="18"/>
+              </w:rPr>
+              <w:t>Se valida permiso de camara, codec, SDP y compatibilidad del softphone.</w:t>
+            </w:r>
+          </w:p>
+        </w:tc>
+        <w:tc>
+          <w:tcPr>
+            <w:tcW w:type="dxa" w:w="3264"/>
+            <w:vAlign w:val="center"/>
+          </w:tcPr>
+          <w:p>
+            <w:pPr>
+              <w:spacing w:after="0"/>
+            </w:pPr>
+            <w:r>
+              <w:rPr>
+                <w:rFonts w:ascii="Arial" w:hAnsi="Arial"/>
+                <w:sz w:val="18"/>
+              </w:rPr>
+            </w:r>
+            <w:r>
+              <w:rPr>
+                <w:rFonts w:ascii="Arial" w:hAnsi="Arial"/>
+                <w:b w:val="0"/>
+                <w:sz w:val="18"/>
+              </w:rPr>
+              <w:t>Captura WebRTC/Linphone y seccion de riesgos.</w:t>
+            </w:r>
+          </w:p>
+        </w:tc>
+      </w:tr>
+      <w:tr>
+        <w:tc>
+          <w:tcPr>
+            <w:tcW w:type="dxa" w:w="3264"/>
+            <w:vAlign w:val="center"/>
+          </w:tcPr>
+          <w:p>
+            <w:pPr>
+              <w:spacing w:after="0"/>
+            </w:pPr>
+            <w:r>
+              <w:rPr>
+                <w:rFonts w:ascii="Arial" w:hAnsi="Arial"/>
+                <w:sz w:val="18"/>
+              </w:rPr>
+            </w:r>
+            <w:r>
+              <w:rPr>
+                <w:rFonts w:ascii="Arial" w:hAnsi="Arial"/>
+                <w:b w:val="0"/>
+                <w:sz w:val="18"/>
+              </w:rPr>
+              <w:t>Base de datos no responde</w:t>
+            </w:r>
+          </w:p>
+        </w:tc>
+        <w:tc>
+          <w:tcPr>
+            <w:tcW w:type="dxa" w:w="3264"/>
+            <w:vAlign w:val="center"/>
+          </w:tcPr>
+          <w:p>
+            <w:pPr>
+              <w:spacing w:after="0"/>
+            </w:pPr>
+            <w:r>
+              <w:rPr>
+                <w:rFonts w:ascii="Arial" w:hAnsi="Arial"/>
+                <w:sz w:val="18"/>
+              </w:rPr>
+            </w:r>
+            <w:r>
+              <w:rPr>
+                <w:rFonts w:ascii="Arial" w:hAnsi="Arial"/>
+                <w:b w:val="0"/>
+                <w:sz w:val="18"/>
+              </w:rPr>
+              <w:t>Se diagnostica PostgreSQL, volumen, credenciales y healthcheck.</w:t>
+            </w:r>
+          </w:p>
+        </w:tc>
+        <w:tc>
+          <w:tcPr>
+            <w:tcW w:type="dxa" w:w="3264"/>
+            <w:vAlign w:val="center"/>
+          </w:tcPr>
+          <w:p>
+            <w:pPr>
+              <w:spacing w:after="0"/>
+            </w:pPr>
+            <w:r>
+              <w:rPr>
+                <w:rFonts w:ascii="Arial" w:hAnsi="Arial"/>
+                <w:sz w:val="18"/>
+              </w:rPr>
+            </w:r>
+            <w:r>
+              <w:rPr>
+                <w:rFonts w:ascii="Arial" w:hAnsi="Arial"/>
+                <w:b w:val="0"/>
+                <w:sz w:val="18"/>
+              </w:rPr>
+              <w:t>psql, tablas users/CDR/audit_events.</w:t>
+            </w:r>
+          </w:p>
+        </w:tc>
+      </w:tr>
+      <w:tr>
+        <w:tc>
+          <w:tcPr>
+            <w:tcW w:type="dxa" w:w="3264"/>
+            <w:vAlign w:val="center"/>
+          </w:tcPr>
+          <w:p>
+            <w:pPr>
+              <w:spacing w:after="0"/>
+            </w:pPr>
+            <w:r>
+              <w:rPr>
+                <w:rFonts w:ascii="Arial" w:hAnsi="Arial"/>
+                <w:sz w:val="18"/>
+              </w:rPr>
+            </w:r>
+            <w:r>
+              <w:rPr>
+                <w:rFonts w:ascii="Arial" w:hAnsi="Arial"/>
+                <w:b w:val="0"/>
+                <w:sz w:val="18"/>
+              </w:rPr>
+              <w:t>midPoint demora</w:t>
+            </w:r>
+          </w:p>
+        </w:tc>
+        <w:tc>
+          <w:tcPr>
+            <w:tcW w:type="dxa" w:w="3264"/>
+            <w:vAlign w:val="center"/>
+          </w:tcPr>
+          <w:p>
+            <w:pPr>
+              <w:spacing w:after="0"/>
+            </w:pPr>
+            <w:r>
+              <w:rPr>
+                <w:rFonts w:ascii="Arial" w:hAnsi="Arial"/>
+                <w:sz w:val="18"/>
+              </w:rPr>
+            </w:r>
+            <w:r>
+              <w:rPr>
+                <w:rFonts w:ascii="Arial" w:hAnsi="Arial"/>
+                <w:b w:val="0"/>
+                <w:sz w:val="18"/>
+              </w:rPr>
+              <w:t>Se explica que IAM tiene arranque pesado y depende de PostgreSQL.</w:t>
+            </w:r>
+          </w:p>
+        </w:tc>
+        <w:tc>
+          <w:tcPr>
+            <w:tcW w:type="dxa" w:w="3264"/>
+            <w:vAlign w:val="center"/>
+          </w:tcPr>
+          <w:p>
+            <w:pPr>
+              <w:spacing w:after="0"/>
+            </w:pPr>
+            <w:r>
+              <w:rPr>
+                <w:rFonts w:ascii="Arial" w:hAnsi="Arial"/>
+                <w:sz w:val="18"/>
+              </w:rPr>
+            </w:r>
+            <w:r>
+              <w:rPr>
+                <w:rFonts w:ascii="Arial" w:hAnsi="Arial"/>
+                <w:b w:val="0"/>
+                <w:sz w:val="18"/>
+              </w:rPr>
+              <w:t>Healthcheck y acceso a consola.</w:t>
+            </w:r>
+          </w:p>
+        </w:tc>
+      </w:tr>
+    </w:tbl>
+    <w:p/>
+    <w:p>
+      <w:pPr>
+        <w:pStyle w:val="Ttulo2"/>
+      </w:pPr>
+      <w:r>
+        <w:rPr>
+          <w:rFonts w:ascii="Arial" w:hAnsi="Arial"/>
+          <w:color w:val="0B3045"/>
+        </w:rPr>
+        <w:t>E.4 Guion breve de sustentacion centrado en proceso</w:t>
+      </w:r>
+    </w:p>
+    <w:p>
+      <w:pPr>
+        <w:spacing w:after="60"/>
+      </w:pPr>
+      <w:r>
+        <w:rPr>
+          <w:rFonts w:ascii="Arial" w:hAnsi="Arial"/>
+          <w:sz w:val="20"/>
+        </w:rPr>
+        <w:t>Paso 1: Problema: un call center necesita comunicaciones, roles, trazabilidad, CDR, auditoria y metricas de calidad.</w:t>
+      </w:r>
+    </w:p>
+    <w:p>
+      <w:pPr>
+        <w:spacing w:after="60"/>
+      </w:pPr>
+      <w:r>
+        <w:rPr>
+          <w:rFonts w:ascii="Arial" w:hAnsi="Arial"/>
+          <w:sz w:val="20"/>
+        </w:rPr>
+        <w:t>Paso 2: Requisitos: se definieron funcionalidades, restricciones, roles y criterios de aceptacion antes de implementar.</w:t>
+      </w:r>
+    </w:p>
+    <w:p>
+      <w:pPr>
+        <w:spacing w:after="60"/>
+      </w:pPr>
+      <w:r>
+        <w:rPr>
+          <w:rFonts w:ascii="Arial" w:hAnsi="Arial"/>
+          <w:sz w:val="20"/>
+        </w:rPr>
+        <w:t>Paso 3: Arquitectura: se eligio microservicios con Docker para separar responsabilidades y mejorar portabilidad.</w:t>
+      </w:r>
+    </w:p>
+    <w:p>
+      <w:pPr>
+        <w:spacing w:after="60"/>
+      </w:pPr>
+      <w:r>
+        <w:rPr>
+          <w:rFonts w:ascii="Arial" w:hAnsi="Arial"/>
+          <w:sz w:val="20"/>
+        </w:rPr>
+        <w:t>Paso 4: Implementacion: se avanzo por fases controladas, no como un unico cambio grande.</w:t>
+      </w:r>
+    </w:p>
+    <w:p>
+      <w:pPr>
+        <w:spacing w:after="60"/>
+      </w:pPr>
+      <w:r>
+        <w:rPr>
+          <w:rFonts w:ascii="Arial" w:hAnsi="Arial"/>
+          <w:sz w:val="20"/>
+        </w:rPr>
+        <w:t>Paso 5: Verificacion: se ejecutaron pruebas automaticas, analisis estatico, analisis de vulnerabilidades y smoke tests.</w:t>
+      </w:r>
+    </w:p>
+    <w:p>
+      <w:pPr>
+        <w:spacing w:after="60"/>
+      </w:pPr>
+      <w:r>
+        <w:rPr>
+          <w:rFonts w:ascii="Arial" w:hAnsi="Arial"/>
+          <w:sz w:val="20"/>
+        </w:rPr>
+        <w:t>Paso 6: Validacion: se demostraron flujos reales con agentes, supervisor, administrador QA, softphones y navegador.</w:t>
+      </w:r>
+    </w:p>
+    <w:p>
+      <w:pPr>
+        <w:spacing w:after="60"/>
+      </w:pPr>
+      <w:r>
+        <w:rPr>
+          <w:rFonts w:ascii="Arial" w:hAnsi="Arial"/>
+          <w:sz w:val="20"/>
+        </w:rPr>
+        <w:t>Paso 7: Riesgos: se declararon limites reales del laboratorio y diferencias frente a produccion.</w:t>
+      </w:r>
+    </w:p>
+    <w:p>
+      <w:pPr>
+        <w:spacing w:after="60"/>
+      </w:pPr>
+      <w:r>
+        <w:rPr>
+          <w:rFonts w:ascii="Arial" w:hAnsi="Arial"/>
+          <w:sz w:val="20"/>
+        </w:rPr>
+        <w:t>Paso 8: Mejora continua: cada hallazgo se transformo en correccion, documento, commit o accion futura.</w:t>
+      </w:r>
+    </w:p>
+    <w:p>
+      <w:pPr>
+        <w:pStyle w:val="Ttulo2"/>
+      </w:pPr>
+      <w:r>
+        <w:rPr>
+          <w:rFonts w:ascii="Arial" w:hAnsi="Arial"/>
+          <w:color w:val="0B3045"/>
+        </w:rPr>
+        <w:t>E.5 Relacion con estandares</w:t>
+      </w:r>
+    </w:p>
+    <w:tbl>
+      <w:tblPr>
+        <w:tblStyle w:val="Tablaconcuadrcula"/>
+        <w:tblW w:type="auto" w:w="0"/>
+        <w:jc w:val="center"/>
+        <w:tblLayout w:type="autofit"/>
+        <w:tblLook w:firstColumn="1" w:firstRow="1" w:lastColumn="0" w:lastRow="0" w:noHBand="0" w:noVBand="1" w:val="04A0"/>
+      </w:tblPr>
+      <w:tblGrid>
+        <w:gridCol w:w="4896"/>
+        <w:gridCol w:w="4896"/>
+      </w:tblGrid>
+      <w:tr>
+        <w:tc>
+          <w:tcPr>
+            <w:tcW w:type="dxa" w:w="4896"/>
+            <w:vAlign w:val="center"/>
+            <w:shd w:fill="0B3045"/>
+          </w:tcPr>
+          <w:p>
+            <w:pPr>
+              <w:spacing w:after="0"/>
+            </w:pPr>
+            <w:r>
+              <w:rPr>
+                <w:rFonts w:ascii="Arial" w:hAnsi="Arial"/>
+                <w:b/>
+                <w:color w:val="FFFFFF"/>
+                <w:sz w:val="18"/>
+              </w:rPr>
+            </w:r>
+            <w:r>
+              <w:rPr>
+                <w:rFonts w:ascii="Arial" w:hAnsi="Arial"/>
+                <w:b/>
+                <w:color w:val="FFFFFF"/>
+                <w:sz w:val="18"/>
+              </w:rPr>
+              <w:t>Estandar o modelo</w:t>
+            </w:r>
+          </w:p>
+        </w:tc>
+        <w:tc>
+          <w:tcPr>
+            <w:tcW w:type="dxa" w:w="4896"/>
+            <w:vAlign w:val="center"/>
+            <w:shd w:fill="0B3045"/>
+          </w:tcPr>
+          <w:p>
+            <w:pPr>
+              <w:spacing w:after="0"/>
+            </w:pPr>
+            <w:r>
+              <w:rPr>
+                <w:rFonts w:ascii="Arial" w:hAnsi="Arial"/>
+                <w:b/>
+                <w:color w:val="FFFFFF"/>
+                <w:sz w:val="18"/>
+              </w:rPr>
+            </w:r>
+            <w:r>
+              <w:rPr>
+                <w:rFonts w:ascii="Arial" w:hAnsi="Arial"/>
+                <w:b/>
+                <w:color w:val="FFFFFF"/>
+                <w:sz w:val="18"/>
+              </w:rPr>
+              <w:t>Como se evidencia en el proceso</w:t>
+            </w:r>
+          </w:p>
+        </w:tc>
+      </w:tr>
+      <w:tr>
+        <w:tc>
+          <w:tcPr>
+            <w:tcW w:type="dxa" w:w="4896"/>
+            <w:vAlign w:val="center"/>
+          </w:tcPr>
+          <w:p>
+            <w:pPr>
+              <w:spacing w:after="0"/>
+            </w:pPr>
+            <w:r>
+              <w:rPr>
+                <w:rFonts w:ascii="Arial" w:hAnsi="Arial"/>
+                <w:sz w:val="18"/>
+              </w:rPr>
+            </w:r>
+            <w:r>
+              <w:rPr>
+                <w:rFonts w:ascii="Arial" w:hAnsi="Arial"/>
+                <w:b w:val="0"/>
+                <w:sz w:val="18"/>
+              </w:rPr>
+              <w:t>ISO/IEC 25010</w:t>
+            </w:r>
+          </w:p>
+        </w:tc>
+        <w:tc>
+          <w:tcPr>
+            <w:tcW w:type="dxa" w:w="4896"/>
+            <w:vAlign w:val="center"/>
+          </w:tcPr>
+          <w:p>
+            <w:pPr>
+              <w:spacing w:after="0"/>
+            </w:pPr>
+            <w:r>
+              <w:rPr>
+                <w:rFonts w:ascii="Arial" w:hAnsi="Arial"/>
+                <w:sz w:val="18"/>
+              </w:rPr>
+            </w:r>
+            <w:r>
+              <w:rPr>
+                <w:rFonts w:ascii="Arial" w:hAnsi="Arial"/>
+                <w:b w:val="0"/>
+                <w:sz w:val="18"/>
+              </w:rPr>
+              <w:t>Se evalua funcionalidad, seguridad, mantenibilidad, portabilidad, compatibilidad y eficiencia.</w:t>
+            </w:r>
+          </w:p>
+        </w:tc>
+      </w:tr>
+      <w:tr>
+        <w:tc>
+          <w:tcPr>
+            <w:tcW w:type="dxa" w:w="4896"/>
+            <w:vAlign w:val="center"/>
+          </w:tcPr>
+          <w:p>
+            <w:pPr>
+              <w:spacing w:after="0"/>
+            </w:pPr>
+            <w:r>
+              <w:rPr>
+                <w:rFonts w:ascii="Arial" w:hAnsi="Arial"/>
+                <w:sz w:val="18"/>
+              </w:rPr>
+            </w:r>
+            <w:r>
+              <w:rPr>
+                <w:rFonts w:ascii="Arial" w:hAnsi="Arial"/>
+                <w:b w:val="0"/>
+                <w:sz w:val="18"/>
+              </w:rPr>
+              <w:t>ISO/IEC 9126 / NTP 9126</w:t>
+            </w:r>
+          </w:p>
+        </w:tc>
+        <w:tc>
+          <w:tcPr>
+            <w:tcW w:type="dxa" w:w="4896"/>
+            <w:vAlign w:val="center"/>
+          </w:tcPr>
+          <w:p>
+            <w:pPr>
+              <w:spacing w:after="0"/>
+            </w:pPr>
+            <w:r>
+              <w:rPr>
+                <w:rFonts w:ascii="Arial" w:hAnsi="Arial"/>
+                <w:sz w:val="18"/>
+              </w:rPr>
+            </w:r>
+            <w:r>
+              <w:rPr>
+                <w:rFonts w:ascii="Arial" w:hAnsi="Arial"/>
+                <w:b w:val="0"/>
+                <w:sz w:val="18"/>
+              </w:rPr>
+              <w:t>Se refuerzan funcionalidad, confiabilidad, usabilidad, eficiencia, mantenibilidad y portabilidad.</w:t>
+            </w:r>
+          </w:p>
+        </w:tc>
+      </w:tr>
+      <w:tr>
+        <w:tc>
+          <w:tcPr>
+            <w:tcW w:type="dxa" w:w="4896"/>
+            <w:vAlign w:val="center"/>
+          </w:tcPr>
+          <w:p>
+            <w:pPr>
+              <w:spacing w:after="0"/>
+            </w:pPr>
+            <w:r>
+              <w:rPr>
+                <w:rFonts w:ascii="Arial" w:hAnsi="Arial"/>
+                <w:sz w:val="18"/>
+              </w:rPr>
+            </w:r>
+            <w:r>
+              <w:rPr>
+                <w:rFonts w:ascii="Arial" w:hAnsi="Arial"/>
+                <w:b w:val="0"/>
+                <w:sz w:val="18"/>
+              </w:rPr>
+              <w:t>ISO/IEC 27001</w:t>
+            </w:r>
+          </w:p>
+        </w:tc>
+        <w:tc>
+          <w:tcPr>
+            <w:tcW w:type="dxa" w:w="4896"/>
+            <w:vAlign w:val="center"/>
+          </w:tcPr>
+          <w:p>
+            <w:pPr>
+              <w:spacing w:after="0"/>
+            </w:pPr>
+            <w:r>
+              <w:rPr>
+                <w:rFonts w:ascii="Arial" w:hAnsi="Arial"/>
+                <w:sz w:val="18"/>
+              </w:rPr>
+            </w:r>
+            <w:r>
+              <w:rPr>
+                <w:rFonts w:ascii="Arial" w:hAnsi="Arial"/>
+                <w:b w:val="0"/>
+                <w:sz w:val="18"/>
+              </w:rPr>
+              <w:t>Se consideran control de acceso, proteccion de credenciales, trazabilidad, red segura y vulnerabilidades.</w:t>
+            </w:r>
+          </w:p>
+        </w:tc>
+      </w:tr>
+      <w:tr>
+        <w:tc>
+          <w:tcPr>
+            <w:tcW w:type="dxa" w:w="4896"/>
+            <w:vAlign w:val="center"/>
+          </w:tcPr>
+          <w:p>
+            <w:pPr>
+              <w:spacing w:after="0"/>
+            </w:pPr>
+            <w:r>
+              <w:rPr>
+                <w:rFonts w:ascii="Arial" w:hAnsi="Arial"/>
+                <w:sz w:val="18"/>
+              </w:rPr>
+            </w:r>
+            <w:r>
+              <w:rPr>
+                <w:rFonts w:ascii="Arial" w:hAnsi="Arial"/>
+                <w:b w:val="0"/>
+                <w:sz w:val="18"/>
+              </w:rPr>
+              <w:t>CMMI</w:t>
+            </w:r>
+          </w:p>
+        </w:tc>
+        <w:tc>
+          <w:tcPr>
+            <w:tcW w:type="dxa" w:w="4896"/>
+            <w:vAlign w:val="center"/>
+          </w:tcPr>
+          <w:p>
+            <w:pPr>
+              <w:spacing w:after="0"/>
+            </w:pPr>
+            <w:r>
+              <w:rPr>
+                <w:rFonts w:ascii="Arial" w:hAnsi="Arial"/>
+                <w:sz w:val="18"/>
+              </w:rPr>
+            </w:r>
+            <w:r>
+              <w:rPr>
+                <w:rFonts w:ascii="Arial" w:hAnsi="Arial"/>
+                <w:b w:val="0"/>
+                <w:sz w:val="18"/>
+              </w:rPr>
+              <w:t>Se evidencia gestion de requisitos, verificacion, validacion, aseguramiento de calidad y configuracion.</w:t>
+            </w:r>
+          </w:p>
+        </w:tc>
+      </w:tr>
+      <w:tr>
+        <w:tc>
+          <w:tcPr>
+            <w:tcW w:type="dxa" w:w="4896"/>
+            <w:vAlign w:val="center"/>
+          </w:tcPr>
+          <w:p>
+            <w:pPr>
+              <w:spacing w:after="0"/>
+            </w:pPr>
+            <w:r>
+              <w:rPr>
+                <w:rFonts w:ascii="Arial" w:hAnsi="Arial"/>
+                <w:sz w:val="18"/>
+              </w:rPr>
+            </w:r>
+            <w:r>
+              <w:rPr>
+                <w:rFonts w:ascii="Arial" w:hAnsi="Arial"/>
+                <w:b w:val="0"/>
+                <w:sz w:val="18"/>
+              </w:rPr>
+              <w:t>PDCA</w:t>
+            </w:r>
+          </w:p>
+        </w:tc>
+        <w:tc>
+          <w:tcPr>
+            <w:tcW w:type="dxa" w:w="4896"/>
+            <w:vAlign w:val="center"/>
+          </w:tcPr>
+          <w:p>
+            <w:pPr>
+              <w:spacing w:after="0"/>
+            </w:pPr>
+            <w:r>
+              <w:rPr>
+                <w:rFonts w:ascii="Arial" w:hAnsi="Arial"/>
+                <w:sz w:val="18"/>
+              </w:rPr>
+            </w:r>
+            <w:r>
+              <w:rPr>
+                <w:rFonts w:ascii="Arial" w:hAnsi="Arial"/>
+                <w:b w:val="0"/>
+                <w:sz w:val="18"/>
+              </w:rPr>
+              <w:t>Se planifica, se implementa, se verifica con pruebas y se actua corrigiendo hallazgos.</w:t>
+            </w:r>
+          </w:p>
+        </w:tc>
+      </w:tr>
+    </w:tbl>
+    <w:p/>
+    <w:p>
+      <w:pPr>
+        <w:pStyle w:val="Ttulo2"/>
+      </w:pPr>
+      <w:r>
+        <w:rPr>
+          <w:rFonts w:ascii="Arial" w:hAnsi="Arial"/>
+          <w:color w:val="0B3045"/>
+        </w:rPr>
+        <w:t>E.6 Conclusion para la defensa</w:t>
+      </w:r>
+    </w:p>
+    <w:p>
+      <w:pPr>
+        <w:spacing w:after="120"/>
+        <w:jc w:val="both"/>
+      </w:pPr>
+      <w:r>
+        <w:rPr>
+          <w:rFonts w:ascii="Arial" w:hAnsi="Arial"/>
+          <w:sz w:val="21"/>
+        </w:rPr>
+        <w:t>La plataforma puede demostrarse funcionando, pero la defensa academica debe destacar el proceso. Incluso si una parte de la demo falla, el equipo puede explicar el diagnostico, el riesgo, la evidencia y la mejora propuesta. Ese enfoque demuestra madurez de calidad de software y es coherente con CMMI, ISO 25010, ISO 9126/NTP 9126 e ISO 27001.</w:t>
       </w:r>
     </w:p>
     <w:sectPr>

</xml_diff>